<commit_message>
Add expanding-window robustness check and revise text for its marginal one-month gain
Co-Authored-By: Claude Opus 5.5 <noreply@anthropic.com>
Claude-Session: https://claude.ai/code/session_016n4FdkJhh6GyuBxjTAwoWb
</commit_message>
<xml_diff>
--- a/paper/cover_letter.docx
+++ b/paper/cover_letter.docx
@@ -185,7 +185,25 @@
         <w:t xml:space="preserve"> </w:t>
       </w:r>
       <w:r>
-        <w:t xml:space="preserve">result holds across window lengths, predictor sets and samples. Two features</w:t>
+        <w:t xml:space="preserve">result holds across rolling-window lengths, predictor sets and samples. Only</w:t>
+      </w:r>
+      <w:r>
+        <w:t xml:space="preserve"> </w:t>
+      </w:r>
+      <w:r>
+        <w:t xml:space="preserve">with an expanding window do two machine-learning forecasts gain a small edge one</w:t>
+      </w:r>
+      <w:r>
+        <w:t xml:space="preserve"> </w:t>
+      </w:r>
+      <w:r>
+        <w:t xml:space="preserve">month ahead (about 5%), and that edge does not survive a correction for multiple</w:t>
+      </w:r>
+      <w:r>
+        <w:t xml:space="preserve"> </w:t>
+      </w:r>
+      <w:r>
+        <w:t xml:space="preserve">testing. Two features</w:t>
       </w:r>
       <w:r>
         <w:t xml:space="preserve"> </w:t>

</xml_diff>